<commit_message>
Chinh sua file bao cao
</commit_message>
<xml_diff>
--- a/lab05.docx
+++ b/lab05.docx
@@ -14,6 +14,17 @@
       <w:r>
         <w:t>:</w:t>
       </w:r>
+      <w:r>
+        <w:t xml:space="preserve"> </w:t>
+      </w:r>
+      <w:hyperlink r:id="rId5" w:history="1">
+        <w:r>
+          <w:rPr>
+            <w:rStyle w:val="Hyperlink"/>
+          </w:rPr>
+          <w:t>https://github.com/phuan-tech/NguyenKhacAnPhu_202418961_lab05.git</w:t>
+        </w:r>
+      </w:hyperlink>
     </w:p>
     <w:p>
       <w:pPr>
@@ -1716,6 +1727,140 @@
       <w:proofErr w:type="spellStart"/>
       <w:r>
         <w:t>dụng</w:t>
+      </w:r>
+      <w:proofErr w:type="spellEnd"/>
+    </w:p>
+    <w:p>
+      <w:r>
+        <w:t xml:space="preserve">+ string </w:t>
+      </w:r>
+      <w:proofErr w:type="spellStart"/>
+      <w:proofErr w:type="gramStart"/>
+      <w:r>
+        <w:t>getDeviceId</w:t>
+      </w:r>
+      <w:proofErr w:type="spellEnd"/>
+      <w:r>
+        <w:t>(</w:t>
+      </w:r>
+      <w:proofErr w:type="gramEnd"/>
+      <w:r>
+        <w:t xml:space="preserve">): </w:t>
+      </w:r>
+      <w:proofErr w:type="spellStart"/>
+      <w:r>
+        <w:t>lấy</w:t>
+      </w:r>
+      <w:proofErr w:type="spellEnd"/>
+      <w:r>
+        <w:t xml:space="preserve"> </w:t>
+      </w:r>
+      <w:proofErr w:type="spellStart"/>
+      <w:r>
+        <w:t>mã</w:t>
+      </w:r>
+      <w:proofErr w:type="spellEnd"/>
+      <w:r>
+        <w:t xml:space="preserve"> </w:t>
+      </w:r>
+      <w:proofErr w:type="spellStart"/>
+      <w:r>
+        <w:t>thiết</w:t>
+      </w:r>
+      <w:proofErr w:type="spellEnd"/>
+      <w:r>
+        <w:t xml:space="preserve"> </w:t>
+      </w:r>
+      <w:proofErr w:type="spellStart"/>
+      <w:r>
+        <w:t>bị</w:t>
+      </w:r>
+      <w:proofErr w:type="spellEnd"/>
+    </w:p>
+    <w:p>
+      <w:r>
+        <w:t xml:space="preserve">+ </w:t>
+      </w:r>
+      <w:proofErr w:type="spellStart"/>
+      <w:r>
+        <w:t>DeviceStatus</w:t>
+      </w:r>
+      <w:proofErr w:type="spellEnd"/>
+      <w:r>
+        <w:t xml:space="preserve"> </w:t>
+      </w:r>
+      <w:proofErr w:type="spellStart"/>
+      <w:proofErr w:type="gramStart"/>
+      <w:r>
+        <w:t>getDeviceStatus</w:t>
+      </w:r>
+      <w:proofErr w:type="spellEnd"/>
+      <w:r>
+        <w:t>(</w:t>
+      </w:r>
+      <w:proofErr w:type="gramEnd"/>
+      <w:r>
+        <w:t xml:space="preserve">): </w:t>
+      </w:r>
+      <w:proofErr w:type="spellStart"/>
+      <w:r>
+        <w:t>lấy</w:t>
+      </w:r>
+      <w:proofErr w:type="spellEnd"/>
+      <w:r>
+        <w:t xml:space="preserve"> </w:t>
+      </w:r>
+      <w:proofErr w:type="spellStart"/>
+      <w:r>
+        <w:t>trạng</w:t>
+      </w:r>
+      <w:proofErr w:type="spellEnd"/>
+      <w:r>
+        <w:t xml:space="preserve"> </w:t>
+      </w:r>
+      <w:proofErr w:type="spellStart"/>
+      <w:r>
+        <w:t>thái</w:t>
+      </w:r>
+      <w:proofErr w:type="spellEnd"/>
+      <w:r>
+        <w:t xml:space="preserve"> </w:t>
+      </w:r>
+      <w:proofErr w:type="spellStart"/>
+      <w:r>
+        <w:t>hoạt</w:t>
+      </w:r>
+      <w:proofErr w:type="spellEnd"/>
+      <w:r>
+        <w:t xml:space="preserve"> </w:t>
+      </w:r>
+      <w:proofErr w:type="spellStart"/>
+      <w:r>
+        <w:t>động</w:t>
+      </w:r>
+      <w:proofErr w:type="spellEnd"/>
+      <w:r>
+        <w:t xml:space="preserve"> </w:t>
+      </w:r>
+      <w:proofErr w:type="spellStart"/>
+      <w:r>
+        <w:t>của</w:t>
+      </w:r>
+      <w:proofErr w:type="spellEnd"/>
+      <w:r>
+        <w:t xml:space="preserve"> </w:t>
+      </w:r>
+      <w:proofErr w:type="spellStart"/>
+      <w:r>
+        <w:t>thiết</w:t>
+      </w:r>
+      <w:proofErr w:type="spellEnd"/>
+      <w:r>
+        <w:t xml:space="preserve"> </w:t>
+      </w:r>
+      <w:proofErr w:type="spellStart"/>
+      <w:r>
+        <w:t>bị</w:t>
       </w:r>
       <w:proofErr w:type="spellEnd"/>
     </w:p>
@@ -2635,6 +2780,33 @@
       <w:r>
         <w:t xml:space="preserve"> ram (int)</w:t>
       </w:r>
+      <w:r>
+        <w:t xml:space="preserve"> </w:t>
+      </w:r>
+      <w:proofErr w:type="spellStart"/>
+      <w:r>
+        <w:t>phải</w:t>
+      </w:r>
+      <w:proofErr w:type="spellEnd"/>
+      <w:r>
+        <w:t xml:space="preserve"> </w:t>
+      </w:r>
+      <w:proofErr w:type="spellStart"/>
+      <w:r>
+        <w:t>lớn</w:t>
+      </w:r>
+      <w:proofErr w:type="spellEnd"/>
+      <w:r>
+        <w:t xml:space="preserve"> </w:t>
+      </w:r>
+      <w:proofErr w:type="spellStart"/>
+      <w:r>
+        <w:t>hơn</w:t>
+      </w:r>
+      <w:proofErr w:type="spellEnd"/>
+      <w:r>
+        <w:t xml:space="preserve"> 0</w:t>
+      </w:r>
     </w:p>
     <w:p>
       <w:r>
@@ -2820,22 +2992,6 @@
       <w:proofErr w:type="spellEnd"/>
       <w:r>
         <w:t xml:space="preserve">: </w:t>
-      </w:r>
-      <w:proofErr w:type="spellStart"/>
-      <w:r>
-        <w:t>ipAddress</w:t>
-      </w:r>
-      <w:proofErr w:type="spellEnd"/>
-      <w:r>
-        <w:t xml:space="preserve"> </w:t>
-      </w:r>
-      <w:proofErr w:type="spellStart"/>
-      <w:r>
-        <w:t>là</w:t>
-      </w:r>
-      <w:proofErr w:type="spellEnd"/>
-      <w:r>
-        <w:t xml:space="preserve"> null, </w:t>
       </w:r>
       <w:proofErr w:type="spellStart"/>
       <w:r>
@@ -2968,6 +3124,17 @@
       </w:r>
       <w:proofErr w:type="spellEnd"/>
       <w:r>
+        <w:t xml:space="preserve">, </w:t>
+      </w:r>
+      <w:proofErr w:type="spellStart"/>
+      <w:r>
+        <w:t>ipAddress</w:t>
+      </w:r>
+      <w:proofErr w:type="spellEnd"/>
+      <w:r>
+        <w:t>: string</w:t>
+      </w:r>
+      <w:r>
         <w:t>)</w:t>
       </w:r>
     </w:p>
@@ -3034,7 +3201,21 @@
       </w:r>
       <w:proofErr w:type="spellEnd"/>
       <w:r>
-        <w:t>: string)</w:t>
+        <w:t>: string</w:t>
+      </w:r>
+      <w:r>
+        <w:t xml:space="preserve">, </w:t>
+      </w:r>
+      <w:proofErr w:type="spellStart"/>
+      <w:r>
+        <w:t>ipAddress</w:t>
+      </w:r>
+      <w:proofErr w:type="spellEnd"/>
+      <w:r>
+        <w:t>: string</w:t>
+      </w:r>
+      <w:r>
+        <w:t>)</w:t>
       </w:r>
       <w:r>
         <w:t xml:space="preserve">: </w:t>
@@ -6222,57 +6403,551 @@
       </w:r>
       <w:proofErr w:type="spellEnd"/>
       <w:r>
+        <w:t>:</w:t>
+      </w:r>
+      <w:r>
+        <w:t xml:space="preserve"> </w:t>
+      </w:r>
+      <w:r>
+        <w:t xml:space="preserve">connected </w:t>
+      </w:r>
+      <w:proofErr w:type="spellStart"/>
+      <w:r>
+        <w:t>là</w:t>
+      </w:r>
+      <w:proofErr w:type="spellEnd"/>
+      <w:r>
+        <w:t xml:space="preserve"> false</w:t>
+      </w:r>
+    </w:p>
+    <w:p>
+      <w:proofErr w:type="spellStart"/>
+      <w:r>
+        <w:t>Có</w:t>
+      </w:r>
+      <w:proofErr w:type="spellEnd"/>
+      <w:r>
+        <w:t xml:space="preserve"> </w:t>
+      </w:r>
+      <w:proofErr w:type="spellStart"/>
+      <w:r>
+        <w:t>các</w:t>
+      </w:r>
+      <w:proofErr w:type="spellEnd"/>
+      <w:r>
+        <w:t xml:space="preserve"> </w:t>
+      </w:r>
+      <w:proofErr w:type="spellStart"/>
+      <w:r>
+        <w:t>thuộc</w:t>
+      </w:r>
+      <w:proofErr w:type="spellEnd"/>
+      <w:r>
+        <w:t xml:space="preserve"> </w:t>
+      </w:r>
+      <w:proofErr w:type="spellStart"/>
+      <w:r>
+        <w:t>tính</w:t>
+      </w:r>
+      <w:proofErr w:type="spellEnd"/>
+      <w:r>
+        <w:t xml:space="preserve"> </w:t>
+      </w:r>
+      <w:proofErr w:type="spellStart"/>
+      <w:r>
+        <w:t>này</w:t>
+      </w:r>
+      <w:proofErr w:type="spellEnd"/>
+      <w:r>
+        <w:t xml:space="preserve"> </w:t>
+      </w:r>
+      <w:proofErr w:type="spellStart"/>
+      <w:r>
+        <w:t>để</w:t>
+      </w:r>
+      <w:proofErr w:type="spellEnd"/>
+      <w:r>
+        <w:t xml:space="preserve"> </w:t>
+      </w:r>
+      <w:proofErr w:type="spellStart"/>
+      <w:r>
+        <w:t>có</w:t>
+      </w:r>
+      <w:proofErr w:type="spellEnd"/>
+      <w:r>
+        <w:t xml:space="preserve"> </w:t>
+      </w:r>
+      <w:proofErr w:type="spellStart"/>
+      <w:r>
+        <w:t>thể</w:t>
+      </w:r>
+      <w:proofErr w:type="spellEnd"/>
+      <w:r>
+        <w:t xml:space="preserve"> </w:t>
+      </w:r>
+      <w:proofErr w:type="spellStart"/>
+      <w:r>
+        <w:t>thực</w:t>
+      </w:r>
+      <w:proofErr w:type="spellEnd"/>
+      <w:r>
+        <w:t xml:space="preserve"> </w:t>
+      </w:r>
+      <w:proofErr w:type="spellStart"/>
+      <w:r>
+        <w:t>thi</w:t>
+      </w:r>
+      <w:proofErr w:type="spellEnd"/>
+      <w:r>
+        <w:t xml:space="preserve"> </w:t>
+      </w:r>
+      <w:proofErr w:type="spellStart"/>
+      <w:r>
+        <w:t>được</w:t>
+      </w:r>
+      <w:proofErr w:type="spellEnd"/>
+      <w:r>
+        <w:t xml:space="preserve"> interface </w:t>
+      </w:r>
+      <w:proofErr w:type="spellStart"/>
+      <w:r>
+        <w:t>INetworkable</w:t>
+      </w:r>
+      <w:proofErr w:type="spellEnd"/>
+    </w:p>
+    <w:p>
+      <w:r>
+        <w:t xml:space="preserve">Các </w:t>
+      </w:r>
+      <w:proofErr w:type="spellStart"/>
+      <w:r>
+        <w:t>phương</w:t>
+      </w:r>
+      <w:proofErr w:type="spellEnd"/>
+      <w:r>
+        <w:t xml:space="preserve"> </w:t>
+      </w:r>
+      <w:proofErr w:type="spellStart"/>
+      <w:r>
+        <w:t>thức</w:t>
+      </w:r>
+      <w:proofErr w:type="spellEnd"/>
+      <w:r>
+        <w:t>:</w:t>
+      </w:r>
+    </w:p>
+    <w:p>
+      <w:r>
+        <w:t xml:space="preserve">2 </w:t>
+      </w:r>
+      <w:proofErr w:type="gramStart"/>
+      <w:r>
+        <w:t>constructor</w:t>
+      </w:r>
+      <w:proofErr w:type="gramEnd"/>
+      <w:r>
+        <w:t>:</w:t>
+      </w:r>
+      <w:r>
+        <w:br/>
+      </w:r>
+      <w:r>
+        <w:t xml:space="preserve">+ </w:t>
+      </w:r>
+      <w:proofErr w:type="spellStart"/>
+      <w:proofErr w:type="gramStart"/>
+      <w:r>
+        <w:t>NetworkPrinter</w:t>
+      </w:r>
+      <w:proofErr w:type="spellEnd"/>
+      <w:r>
+        <w:t>(</w:t>
+      </w:r>
+      <w:proofErr w:type="spellStart"/>
+      <w:proofErr w:type="gramEnd"/>
+      <w:r>
+        <w:t>deviceId</w:t>
+      </w:r>
+      <w:proofErr w:type="spellEnd"/>
+      <w:r>
+        <w:t xml:space="preserve">: string, </w:t>
+      </w:r>
+      <w:proofErr w:type="spellStart"/>
+      <w:r>
+        <w:t>deviceName</w:t>
+      </w:r>
+      <w:proofErr w:type="spellEnd"/>
+      <w:r>
+        <w:t xml:space="preserve">: string, </w:t>
+      </w:r>
+      <w:proofErr w:type="spellStart"/>
+      <w:r>
+        <w:t>commissioningYear</w:t>
+      </w:r>
+      <w:proofErr w:type="spellEnd"/>
+      <w:r>
+        <w:t xml:space="preserve">: int, </w:t>
+      </w:r>
+      <w:proofErr w:type="spellStart"/>
+      <w:r>
+        <w:t>purchasePrice</w:t>
+      </w:r>
+      <w:proofErr w:type="spellEnd"/>
+      <w:r>
+        <w:t xml:space="preserve">: double, status: </w:t>
+      </w:r>
+      <w:proofErr w:type="spellStart"/>
+      <w:r>
+        <w:t>DeviceStatus</w:t>
+      </w:r>
+      <w:proofErr w:type="spellEnd"/>
+      <w:r>
+        <w:t xml:space="preserve">, </w:t>
+      </w:r>
+      <w:proofErr w:type="spellStart"/>
+      <w:r>
+        <w:t>printerType</w:t>
+      </w:r>
+      <w:proofErr w:type="spellEnd"/>
+      <w:r>
         <w:t xml:space="preserve">: </w:t>
       </w:r>
       <w:proofErr w:type="spellStart"/>
       <w:r>
+        <w:t>PrinterType</w:t>
+      </w:r>
+      <w:proofErr w:type="spellEnd"/>
+      <w:r>
+        <w:t xml:space="preserve">, </w:t>
+      </w:r>
+      <w:proofErr w:type="spellStart"/>
+      <w:r>
+        <w:t>pagesPrinted</w:t>
+      </w:r>
+      <w:proofErr w:type="spellEnd"/>
+      <w:r>
+        <w:t xml:space="preserve">: int, </w:t>
+      </w:r>
+      <w:proofErr w:type="spellStart"/>
+      <w:r>
+        <w:t>isColorPrinter</w:t>
+      </w:r>
+      <w:proofErr w:type="spellEnd"/>
+      <w:r>
+        <w:t xml:space="preserve">: </w:t>
+      </w:r>
+      <w:proofErr w:type="spellStart"/>
+      <w:r>
+        <w:t>boolean</w:t>
+      </w:r>
+      <w:proofErr w:type="spellEnd"/>
+      <w:r>
+        <w:t xml:space="preserve">, </w:t>
+      </w:r>
+      <w:proofErr w:type="spellStart"/>
+      <w:r>
         <w:t>ipAddress</w:t>
       </w:r>
       <w:proofErr w:type="spellEnd"/>
       <w:r>
-        <w:t xml:space="preserve"> </w:t>
-      </w:r>
-      <w:proofErr w:type="spellStart"/>
-      <w:r>
-        <w:t>là</w:t>
-      </w:r>
-      <w:proofErr w:type="spellEnd"/>
-      <w:r>
-        <w:t xml:space="preserve"> null, </w:t>
-      </w:r>
-      <w:proofErr w:type="spellStart"/>
-      <w:r>
-        <w:t>còn</w:t>
-      </w:r>
-      <w:proofErr w:type="spellEnd"/>
-      <w:r>
-        <w:t xml:space="preserve"> connected </w:t>
-      </w:r>
-      <w:proofErr w:type="spellStart"/>
-      <w:r>
-        <w:t>là</w:t>
-      </w:r>
-      <w:proofErr w:type="spellEnd"/>
-      <w:r>
-        <w:t xml:space="preserve"> false</w:t>
-      </w:r>
-    </w:p>
-    <w:p>
-      <w:proofErr w:type="spellStart"/>
-      <w:r>
-        <w:t>Có</w:t>
-      </w:r>
-      <w:proofErr w:type="spellEnd"/>
-      <w:r>
-        <w:t xml:space="preserve"> </w:t>
-      </w:r>
-      <w:proofErr w:type="spellStart"/>
-      <w:r>
-        <w:t>các</w:t>
-      </w:r>
-      <w:proofErr w:type="spellEnd"/>
-      <w:r>
-        <w:t xml:space="preserve"> </w:t>
+        <w:t>: string</w:t>
+      </w:r>
+      <w:r>
+        <w:t>)</w:t>
+      </w:r>
+    </w:p>
+    <w:p>
+      <w:r>
+        <w:t xml:space="preserve">+ </w:t>
+      </w:r>
+      <w:proofErr w:type="spellStart"/>
+      <w:proofErr w:type="gramStart"/>
+      <w:r>
+        <w:t>NetworkPrinter</w:t>
+      </w:r>
+      <w:proofErr w:type="spellEnd"/>
+      <w:r>
+        <w:t>(</w:t>
+      </w:r>
+      <w:proofErr w:type="spellStart"/>
+      <w:proofErr w:type="gramEnd"/>
+      <w:r>
+        <w:t>deviceId</w:t>
+      </w:r>
+      <w:proofErr w:type="spellEnd"/>
+      <w:r>
+        <w:t xml:space="preserve">: string, </w:t>
+      </w:r>
+      <w:proofErr w:type="spellStart"/>
+      <w:r>
+        <w:t>deviceName</w:t>
+      </w:r>
+      <w:proofErr w:type="spellEnd"/>
+      <w:r>
+        <w:t xml:space="preserve">: string, </w:t>
+      </w:r>
+      <w:proofErr w:type="spellStart"/>
+      <w:r>
+        <w:t>commissioningYear</w:t>
+      </w:r>
+      <w:proofErr w:type="spellEnd"/>
+      <w:r>
+        <w:t xml:space="preserve">: int, </w:t>
+      </w:r>
+      <w:proofErr w:type="spellStart"/>
+      <w:r>
+        <w:t>purchasePrice</w:t>
+      </w:r>
+      <w:proofErr w:type="spellEnd"/>
+      <w:r>
+        <w:t xml:space="preserve">: double, status: </w:t>
+      </w:r>
+      <w:proofErr w:type="spellStart"/>
+      <w:r>
+        <w:t>DeviceStatus</w:t>
+      </w:r>
+      <w:proofErr w:type="spellEnd"/>
+      <w:r>
+        <w:t xml:space="preserve">, </w:t>
+      </w:r>
+      <w:proofErr w:type="spellStart"/>
+      <w:r>
+        <w:t>printerType</w:t>
+      </w:r>
+      <w:proofErr w:type="spellEnd"/>
+      <w:r>
+        <w:t xml:space="preserve">: </w:t>
+      </w:r>
+      <w:proofErr w:type="spellStart"/>
+      <w:r>
+        <w:t>PrinterType</w:t>
+      </w:r>
+      <w:proofErr w:type="spellEnd"/>
+      <w:r>
+        <w:t xml:space="preserve">, </w:t>
+      </w:r>
+      <w:proofErr w:type="spellStart"/>
+      <w:r>
+        <w:t>pagesPrinted</w:t>
+      </w:r>
+      <w:proofErr w:type="spellEnd"/>
+      <w:r>
+        <w:t>: int</w:t>
+      </w:r>
+      <w:r>
+        <w:t xml:space="preserve">, </w:t>
+      </w:r>
+      <w:proofErr w:type="spellStart"/>
+      <w:r>
+        <w:t>ipAddress</w:t>
+      </w:r>
+      <w:proofErr w:type="spellEnd"/>
+      <w:r>
+        <w:t>: string</w:t>
+      </w:r>
+      <w:r>
+        <w:t>)</w:t>
+      </w:r>
+    </w:p>
+    <w:p>
+      <w:r>
+        <w:t xml:space="preserve">Các </w:t>
+      </w:r>
+      <w:proofErr w:type="spellStart"/>
+      <w:r>
+        <w:t>phương</w:t>
+      </w:r>
+      <w:proofErr w:type="spellEnd"/>
+      <w:r>
+        <w:t xml:space="preserve"> </w:t>
+      </w:r>
+      <w:proofErr w:type="spellStart"/>
+      <w:r>
+        <w:t>thức</w:t>
+      </w:r>
+      <w:proofErr w:type="spellEnd"/>
+      <w:r>
+        <w:t xml:space="preserve"> </w:t>
+      </w:r>
+      <w:proofErr w:type="spellStart"/>
+      <w:r>
+        <w:t>thực</w:t>
+      </w:r>
+      <w:proofErr w:type="spellEnd"/>
+      <w:r>
+        <w:t xml:space="preserve"> </w:t>
+      </w:r>
+      <w:proofErr w:type="spellStart"/>
+      <w:r>
+        <w:t>thi</w:t>
+      </w:r>
+      <w:proofErr w:type="spellEnd"/>
+      <w:r>
+        <w:t xml:space="preserve"> </w:t>
+      </w:r>
+      <w:proofErr w:type="spellStart"/>
+      <w:r>
+        <w:t>từ</w:t>
+      </w:r>
+      <w:proofErr w:type="spellEnd"/>
+      <w:r>
+        <w:t xml:space="preserve"> </w:t>
+      </w:r>
+      <w:proofErr w:type="spellStart"/>
+      <w:r>
+        <w:t>giao</w:t>
+      </w:r>
+      <w:proofErr w:type="spellEnd"/>
+      <w:r>
+        <w:t xml:space="preserve"> </w:t>
+      </w:r>
+      <w:proofErr w:type="spellStart"/>
+      <w:r>
+        <w:t>diện</w:t>
+      </w:r>
+      <w:proofErr w:type="spellEnd"/>
+      <w:r>
+        <w:t xml:space="preserve"> </w:t>
+      </w:r>
+      <w:proofErr w:type="spellStart"/>
+      <w:r>
+        <w:t>INetworkable</w:t>
+      </w:r>
+      <w:proofErr w:type="spellEnd"/>
+      <w:r>
+        <w:t>:</w:t>
+      </w:r>
+    </w:p>
+    <w:p>
+      <w:r>
+        <w:t xml:space="preserve">+ string </w:t>
+      </w:r>
+      <w:proofErr w:type="spellStart"/>
+      <w:proofErr w:type="gramStart"/>
+      <w:r>
+        <w:t>getIpAddress</w:t>
+      </w:r>
+      <w:proofErr w:type="spellEnd"/>
+      <w:r>
+        <w:t>(</w:t>
+      </w:r>
+      <w:proofErr w:type="gramEnd"/>
+      <w:r>
+        <w:t>)</w:t>
+      </w:r>
+    </w:p>
+    <w:p>
+      <w:r>
+        <w:t xml:space="preserve">+ void </w:t>
+      </w:r>
+      <w:proofErr w:type="gramStart"/>
+      <w:r>
+        <w:t>connect(</w:t>
+      </w:r>
+      <w:proofErr w:type="spellStart"/>
+      <w:proofErr w:type="gramEnd"/>
+      <w:r>
+        <w:t>ipAddress</w:t>
+      </w:r>
+      <w:proofErr w:type="spellEnd"/>
+      <w:r>
+        <w:t>: string)</w:t>
+      </w:r>
+    </w:p>
+    <w:p>
+      <w:r>
+        <w:t xml:space="preserve">+ void </w:t>
+      </w:r>
+      <w:proofErr w:type="gramStart"/>
+      <w:r>
+        <w:t>disconnect(</w:t>
+      </w:r>
+      <w:proofErr w:type="gramEnd"/>
+      <w:r>
+        <w:t>)</w:t>
+      </w:r>
+    </w:p>
+    <w:p>
+      <w:r>
+        <w:t xml:space="preserve">+ bool </w:t>
+      </w:r>
+      <w:proofErr w:type="spellStart"/>
+      <w:proofErr w:type="gramStart"/>
+      <w:r>
+        <w:t>isConnected</w:t>
+      </w:r>
+      <w:proofErr w:type="spellEnd"/>
+      <w:r>
+        <w:t>(</w:t>
+      </w:r>
+      <w:proofErr w:type="gramEnd"/>
+      <w:r>
+        <w:t>)</w:t>
+      </w:r>
+    </w:p>
+    <w:p>
+      <w:r>
+        <w:t xml:space="preserve">Các </w:t>
+      </w:r>
+      <w:proofErr w:type="spellStart"/>
+      <w:r>
+        <w:t>phương</w:t>
+      </w:r>
+      <w:proofErr w:type="spellEnd"/>
+      <w:r>
+        <w:t xml:space="preserve"> </w:t>
+      </w:r>
+      <w:proofErr w:type="spellStart"/>
+      <w:r>
+        <w:t>thức</w:t>
+      </w:r>
+      <w:proofErr w:type="spellEnd"/>
+      <w:r>
+        <w:t xml:space="preserve"> </w:t>
+      </w:r>
+      <w:proofErr w:type="spellStart"/>
+      <w:r>
+        <w:t>ghi</w:t>
+      </w:r>
+      <w:proofErr w:type="spellEnd"/>
+      <w:r>
+        <w:t xml:space="preserve"> </w:t>
+      </w:r>
+      <w:proofErr w:type="spellStart"/>
+      <w:r>
+        <w:t>đè</w:t>
+      </w:r>
+      <w:proofErr w:type="spellEnd"/>
+      <w:r>
+        <w:t xml:space="preserve"> (override):</w:t>
+      </w:r>
+    </w:p>
+    <w:p>
+      <w:r>
+        <w:t xml:space="preserve">+ string </w:t>
+      </w:r>
+      <w:proofErr w:type="spellStart"/>
+      <w:proofErr w:type="gramStart"/>
+      <w:r>
+        <w:t>displayInfo</w:t>
+      </w:r>
+      <w:proofErr w:type="spellEnd"/>
+      <w:r>
+        <w:t>(</w:t>
+      </w:r>
+      <w:proofErr w:type="gramEnd"/>
+      <w:r>
+        <w:t>)</w:t>
+      </w:r>
+    </w:p>
+    <w:p>
+      <w:r>
+        <w:t>2.4. Projector</w:t>
+      </w:r>
+    </w:p>
+    <w:p>
+      <w:r>
+        <w:t xml:space="preserve">Các </w:t>
       </w:r>
       <w:proofErr w:type="spellStart"/>
       <w:r>
@@ -6288,51 +6963,149 @@
       </w:r>
       <w:proofErr w:type="spellEnd"/>
       <w:r>
-        <w:t xml:space="preserve"> </w:t>
-      </w:r>
-      <w:proofErr w:type="spellStart"/>
-      <w:r>
-        <w:t>này</w:t>
-      </w:r>
-      <w:proofErr w:type="spellEnd"/>
-      <w:r>
-        <w:t xml:space="preserve"> </w:t>
-      </w:r>
-      <w:proofErr w:type="spellStart"/>
-      <w:r>
-        <w:t>để</w:t>
-      </w:r>
-      <w:proofErr w:type="spellEnd"/>
-      <w:r>
-        <w:t xml:space="preserve"> </w:t>
-      </w:r>
-      <w:proofErr w:type="spellStart"/>
-      <w:r>
-        <w:t>có</w:t>
-      </w:r>
-      <w:proofErr w:type="spellEnd"/>
-      <w:r>
-        <w:t xml:space="preserve"> </w:t>
-      </w:r>
-      <w:proofErr w:type="spellStart"/>
-      <w:r>
-        <w:t>thể</w:t>
-      </w:r>
-      <w:proofErr w:type="spellEnd"/>
-      <w:r>
-        <w:t xml:space="preserve"> </w:t>
-      </w:r>
-      <w:proofErr w:type="spellStart"/>
-      <w:r>
-        <w:t>thực</w:t>
-      </w:r>
-      <w:proofErr w:type="spellEnd"/>
-      <w:r>
-        <w:t xml:space="preserve"> </w:t>
-      </w:r>
-      <w:proofErr w:type="spellStart"/>
-      <w:r>
-        <w:t>thi</w:t>
+        <w:t>:</w:t>
+      </w:r>
+    </w:p>
+    <w:p>
+      <w:r>
+        <w:t xml:space="preserve">- brightness: </w:t>
+      </w:r>
+      <w:proofErr w:type="spellStart"/>
+      <w:r>
+        <w:t>độ</w:t>
+      </w:r>
+      <w:proofErr w:type="spellEnd"/>
+      <w:r>
+        <w:t xml:space="preserve"> </w:t>
+      </w:r>
+      <w:proofErr w:type="spellStart"/>
+      <w:r>
+        <w:t>sáng</w:t>
+      </w:r>
+      <w:proofErr w:type="spellEnd"/>
+      <w:r>
+        <w:t xml:space="preserve"> (int)</w:t>
+      </w:r>
+    </w:p>
+    <w:p>
+      <w:r>
+        <w:t xml:space="preserve">- </w:t>
+      </w:r>
+      <w:proofErr w:type="spellStart"/>
+      <w:r>
+        <w:t>lampHoursUsed</w:t>
+      </w:r>
+      <w:proofErr w:type="spellEnd"/>
+      <w:r>
+        <w:t xml:space="preserve">: </w:t>
+      </w:r>
+      <w:proofErr w:type="spellStart"/>
+      <w:r>
+        <w:t>số</w:t>
+      </w:r>
+      <w:proofErr w:type="spellEnd"/>
+      <w:r>
+        <w:t xml:space="preserve"> </w:t>
+      </w:r>
+      <w:proofErr w:type="spellStart"/>
+      <w:r>
+        <w:t>giờ</w:t>
+      </w:r>
+      <w:proofErr w:type="spellEnd"/>
+      <w:r>
+        <w:t xml:space="preserve"> </w:t>
+      </w:r>
+      <w:proofErr w:type="spellStart"/>
+      <w:r>
+        <w:t>sử</w:t>
+      </w:r>
+      <w:proofErr w:type="spellEnd"/>
+      <w:r>
+        <w:t xml:space="preserve"> </w:t>
+      </w:r>
+      <w:proofErr w:type="spellStart"/>
+      <w:r>
+        <w:t>dụng</w:t>
+      </w:r>
+      <w:proofErr w:type="spellEnd"/>
+      <w:r>
+        <w:t xml:space="preserve"> </w:t>
+      </w:r>
+      <w:proofErr w:type="spellStart"/>
+      <w:r>
+        <w:t>bóng</w:t>
+      </w:r>
+      <w:proofErr w:type="spellEnd"/>
+      <w:r>
+        <w:t xml:space="preserve"> </w:t>
+      </w:r>
+      <w:proofErr w:type="spellStart"/>
+      <w:r>
+        <w:t>đèn</w:t>
+      </w:r>
+      <w:proofErr w:type="spellEnd"/>
+      <w:r>
+        <w:t xml:space="preserve"> (</w:t>
+      </w:r>
+      <w:r>
+        <w:t>double</w:t>
+      </w:r>
+      <w:r>
+        <w:t>)</w:t>
+      </w:r>
+    </w:p>
+    <w:p>
+      <w:proofErr w:type="spellStart"/>
+      <w:r>
+        <w:t>Tất</w:t>
+      </w:r>
+      <w:proofErr w:type="spellEnd"/>
+      <w:r>
+        <w:t xml:space="preserve"> </w:t>
+      </w:r>
+      <w:proofErr w:type="spellStart"/>
+      <w:r>
+        <w:t>cả</w:t>
+      </w:r>
+      <w:proofErr w:type="spellEnd"/>
+      <w:r>
+        <w:t xml:space="preserve"> </w:t>
+      </w:r>
+      <w:proofErr w:type="spellStart"/>
+      <w:r>
+        <w:t>thuộc</w:t>
+      </w:r>
+      <w:proofErr w:type="spellEnd"/>
+      <w:r>
+        <w:t xml:space="preserve"> </w:t>
+      </w:r>
+      <w:proofErr w:type="spellStart"/>
+      <w:r>
+        <w:t>tính</w:t>
+      </w:r>
+      <w:proofErr w:type="spellEnd"/>
+      <w:r>
+        <w:t xml:space="preserve"> </w:t>
+      </w:r>
+      <w:proofErr w:type="spellStart"/>
+      <w:r>
+        <w:t>trên</w:t>
+      </w:r>
+      <w:proofErr w:type="spellEnd"/>
+      <w:r>
+        <w:t xml:space="preserve"> </w:t>
+      </w:r>
+      <w:proofErr w:type="spellStart"/>
+      <w:r>
+        <w:t>đều</w:t>
+      </w:r>
+      <w:proofErr w:type="spellEnd"/>
+      <w:r>
+        <w:t xml:space="preserve"> </w:t>
+      </w:r>
+      <w:proofErr w:type="spellStart"/>
+      <w:r>
+        <w:t>không</w:t>
       </w:r>
       <w:proofErr w:type="spellEnd"/>
       <w:r>
@@ -6344,491 +7117,13 @@
       </w:r>
       <w:proofErr w:type="spellEnd"/>
       <w:r>
-        <w:t xml:space="preserve"> interface </w:t>
-      </w:r>
-      <w:proofErr w:type="spellStart"/>
-      <w:r>
-        <w:t>INetworkable</w:t>
-      </w:r>
-      <w:proofErr w:type="spellEnd"/>
-    </w:p>
-    <w:p>
-      <w:r>
-        <w:t xml:space="preserve">Các </w:t>
-      </w:r>
-      <w:proofErr w:type="spellStart"/>
-      <w:r>
-        <w:t>phương</w:t>
-      </w:r>
-      <w:proofErr w:type="spellEnd"/>
-      <w:r>
-        <w:t xml:space="preserve"> </w:t>
-      </w:r>
-      <w:proofErr w:type="spellStart"/>
-      <w:r>
-        <w:t>thức</w:t>
-      </w:r>
-      <w:proofErr w:type="spellEnd"/>
-      <w:r>
-        <w:t>:</w:t>
-      </w:r>
-    </w:p>
-    <w:p>
-      <w:r>
-        <w:t xml:space="preserve">2 </w:t>
-      </w:r>
-      <w:proofErr w:type="gramStart"/>
-      <w:r>
-        <w:t>constructor</w:t>
-      </w:r>
-      <w:proofErr w:type="gramEnd"/>
-      <w:r>
-        <w:t>:</w:t>
-      </w:r>
-      <w:r>
-        <w:br/>
-      </w:r>
-      <w:r>
-        <w:t xml:space="preserve">+ </w:t>
-      </w:r>
-      <w:proofErr w:type="spellStart"/>
-      <w:proofErr w:type="gramStart"/>
-      <w:r>
-        <w:t>NetworkPrinter</w:t>
-      </w:r>
-      <w:proofErr w:type="spellEnd"/>
-      <w:r>
-        <w:t>(</w:t>
-      </w:r>
-      <w:proofErr w:type="spellStart"/>
-      <w:proofErr w:type="gramEnd"/>
-      <w:r>
-        <w:t>deviceId</w:t>
-      </w:r>
-      <w:proofErr w:type="spellEnd"/>
-      <w:r>
-        <w:t xml:space="preserve">: string, </w:t>
-      </w:r>
-      <w:proofErr w:type="spellStart"/>
-      <w:r>
-        <w:t>deviceName</w:t>
-      </w:r>
-      <w:proofErr w:type="spellEnd"/>
-      <w:r>
-        <w:t xml:space="preserve">: string, </w:t>
-      </w:r>
-      <w:proofErr w:type="spellStart"/>
-      <w:r>
-        <w:t>commissioningYear</w:t>
-      </w:r>
-      <w:proofErr w:type="spellEnd"/>
-      <w:r>
-        <w:t xml:space="preserve">: int, </w:t>
-      </w:r>
-      <w:proofErr w:type="spellStart"/>
-      <w:r>
-        <w:t>purchasePrice</w:t>
-      </w:r>
-      <w:proofErr w:type="spellEnd"/>
-      <w:r>
-        <w:t xml:space="preserve">: double, status: </w:t>
-      </w:r>
-      <w:proofErr w:type="spellStart"/>
-      <w:r>
-        <w:t>DeviceStatus</w:t>
-      </w:r>
-      <w:proofErr w:type="spellEnd"/>
-      <w:r>
-        <w:t xml:space="preserve">, </w:t>
-      </w:r>
-      <w:proofErr w:type="spellStart"/>
-      <w:r>
-        <w:t>printerType</w:t>
-      </w:r>
-      <w:proofErr w:type="spellEnd"/>
-      <w:r>
-        <w:t xml:space="preserve">: </w:t>
-      </w:r>
-      <w:proofErr w:type="spellStart"/>
-      <w:r>
-        <w:t>PrinterType</w:t>
-      </w:r>
-      <w:proofErr w:type="spellEnd"/>
-      <w:r>
-        <w:t xml:space="preserve">, </w:t>
-      </w:r>
-      <w:proofErr w:type="spellStart"/>
-      <w:r>
-        <w:t>pagesPrinted</w:t>
-      </w:r>
-      <w:proofErr w:type="spellEnd"/>
-      <w:r>
-        <w:t xml:space="preserve">: int, </w:t>
-      </w:r>
-      <w:proofErr w:type="spellStart"/>
-      <w:r>
-        <w:t>isColorPrinter</w:t>
-      </w:r>
-      <w:proofErr w:type="spellEnd"/>
-      <w:r>
-        <w:t xml:space="preserve">: </w:t>
-      </w:r>
-      <w:proofErr w:type="spellStart"/>
-      <w:r>
-        <w:t>boolean</w:t>
-      </w:r>
-      <w:proofErr w:type="spellEnd"/>
-      <w:r>
-        <w:t>)</w:t>
-      </w:r>
-    </w:p>
-    <w:p>
-      <w:r>
-        <w:t xml:space="preserve">+ </w:t>
-      </w:r>
-      <w:proofErr w:type="spellStart"/>
-      <w:proofErr w:type="gramStart"/>
-      <w:r>
-        <w:t>NetworkPrinter</w:t>
-      </w:r>
-      <w:proofErr w:type="spellEnd"/>
-      <w:r>
-        <w:t>(</w:t>
-      </w:r>
-      <w:proofErr w:type="spellStart"/>
-      <w:proofErr w:type="gramEnd"/>
-      <w:r>
-        <w:t>deviceId</w:t>
-      </w:r>
-      <w:proofErr w:type="spellEnd"/>
-      <w:r>
-        <w:t xml:space="preserve">: string, </w:t>
-      </w:r>
-      <w:proofErr w:type="spellStart"/>
-      <w:r>
-        <w:t>deviceName</w:t>
-      </w:r>
-      <w:proofErr w:type="spellEnd"/>
-      <w:r>
-        <w:t xml:space="preserve">: string, </w:t>
-      </w:r>
-      <w:proofErr w:type="spellStart"/>
-      <w:r>
-        <w:t>commissioningYear</w:t>
-      </w:r>
-      <w:proofErr w:type="spellEnd"/>
-      <w:r>
-        <w:t xml:space="preserve">: int, </w:t>
-      </w:r>
-      <w:proofErr w:type="spellStart"/>
-      <w:r>
-        <w:t>purchasePrice</w:t>
-      </w:r>
-      <w:proofErr w:type="spellEnd"/>
-      <w:r>
-        <w:t xml:space="preserve">: double, status: </w:t>
-      </w:r>
-      <w:proofErr w:type="spellStart"/>
-      <w:r>
-        <w:t>DeviceStatus</w:t>
-      </w:r>
-      <w:proofErr w:type="spellEnd"/>
-      <w:r>
-        <w:t xml:space="preserve">, </w:t>
-      </w:r>
-      <w:proofErr w:type="spellStart"/>
-      <w:r>
-        <w:t>printerType</w:t>
-      </w:r>
-      <w:proofErr w:type="spellEnd"/>
-      <w:r>
-        <w:t xml:space="preserve">: </w:t>
-      </w:r>
-      <w:proofErr w:type="spellStart"/>
-      <w:r>
-        <w:t>PrinterType</w:t>
-      </w:r>
-      <w:proofErr w:type="spellEnd"/>
-      <w:r>
-        <w:t xml:space="preserve">, </w:t>
-      </w:r>
-      <w:proofErr w:type="spellStart"/>
-      <w:r>
-        <w:t>pagesPrinted</w:t>
-      </w:r>
-      <w:proofErr w:type="spellEnd"/>
-      <w:r>
-        <w:t>: int)</w:t>
-      </w:r>
-    </w:p>
-    <w:p>
-      <w:r>
-        <w:t xml:space="preserve">Các </w:t>
-      </w:r>
-      <w:proofErr w:type="spellStart"/>
-      <w:r>
-        <w:t>phương</w:t>
-      </w:r>
-      <w:proofErr w:type="spellEnd"/>
-      <w:r>
-        <w:t xml:space="preserve"> </w:t>
-      </w:r>
-      <w:proofErr w:type="spellStart"/>
-      <w:r>
-        <w:t>thức</w:t>
-      </w:r>
-      <w:proofErr w:type="spellEnd"/>
-      <w:r>
-        <w:t xml:space="preserve"> </w:t>
-      </w:r>
-      <w:proofErr w:type="spellStart"/>
-      <w:r>
-        <w:t>thực</w:t>
-      </w:r>
-      <w:proofErr w:type="spellEnd"/>
-      <w:r>
-        <w:t xml:space="preserve"> </w:t>
-      </w:r>
-      <w:proofErr w:type="spellStart"/>
-      <w:r>
-        <w:t>thi</w:t>
-      </w:r>
-      <w:proofErr w:type="spellEnd"/>
-      <w:r>
-        <w:t xml:space="preserve"> </w:t>
-      </w:r>
-      <w:proofErr w:type="spellStart"/>
-      <w:r>
-        <w:t>từ</w:t>
-      </w:r>
-      <w:proofErr w:type="spellEnd"/>
-      <w:r>
-        <w:t xml:space="preserve"> </w:t>
-      </w:r>
-      <w:proofErr w:type="spellStart"/>
-      <w:r>
-        <w:t>giao</w:t>
-      </w:r>
-      <w:proofErr w:type="spellEnd"/>
-      <w:r>
-        <w:t xml:space="preserve"> </w:t>
-      </w:r>
-      <w:proofErr w:type="spellStart"/>
-      <w:r>
-        <w:t>diện</w:t>
-      </w:r>
-      <w:proofErr w:type="spellEnd"/>
-      <w:r>
-        <w:t xml:space="preserve"> </w:t>
-      </w:r>
-      <w:proofErr w:type="spellStart"/>
-      <w:r>
-        <w:t>INetworkable</w:t>
-      </w:r>
-      <w:proofErr w:type="spellEnd"/>
-      <w:r>
-        <w:t>:</w:t>
-      </w:r>
-    </w:p>
-    <w:p>
-      <w:r>
-        <w:t xml:space="preserve">+ string </w:t>
-      </w:r>
-      <w:proofErr w:type="spellStart"/>
-      <w:proofErr w:type="gramStart"/>
-      <w:r>
-        <w:t>getIpAddress</w:t>
-      </w:r>
-      <w:proofErr w:type="spellEnd"/>
-      <w:r>
-        <w:t>(</w:t>
-      </w:r>
-      <w:proofErr w:type="gramEnd"/>
-      <w:r>
-        <w:t>)</w:t>
-      </w:r>
-    </w:p>
-    <w:p>
-      <w:r>
-        <w:t xml:space="preserve">+ void </w:t>
-      </w:r>
-      <w:proofErr w:type="gramStart"/>
-      <w:r>
-        <w:t>connect(</w:t>
-      </w:r>
-      <w:proofErr w:type="spellStart"/>
-      <w:proofErr w:type="gramEnd"/>
-      <w:r>
-        <w:t>ipAddress</w:t>
-      </w:r>
-      <w:proofErr w:type="spellEnd"/>
-      <w:r>
-        <w:t>: string)</w:t>
-      </w:r>
-    </w:p>
-    <w:p>
-      <w:r>
-        <w:t xml:space="preserve">+ void </w:t>
-      </w:r>
-      <w:proofErr w:type="gramStart"/>
-      <w:r>
-        <w:t>disconnect(</w:t>
-      </w:r>
-      <w:proofErr w:type="gramEnd"/>
-      <w:r>
-        <w:t>)</w:t>
-      </w:r>
-    </w:p>
-    <w:p>
-      <w:r>
-        <w:t xml:space="preserve">+ bool </w:t>
-      </w:r>
-      <w:proofErr w:type="spellStart"/>
-      <w:proofErr w:type="gramStart"/>
-      <w:r>
-        <w:t>isConnected</w:t>
-      </w:r>
-      <w:proofErr w:type="spellEnd"/>
-      <w:r>
-        <w:t>(</w:t>
-      </w:r>
-      <w:proofErr w:type="gramEnd"/>
-      <w:r>
-        <w:t>)</w:t>
-      </w:r>
-    </w:p>
-    <w:p>
-      <w:r>
-        <w:t xml:space="preserve">Các </w:t>
-      </w:r>
-      <w:proofErr w:type="spellStart"/>
-      <w:r>
-        <w:t>phương</w:t>
-      </w:r>
-      <w:proofErr w:type="spellEnd"/>
-      <w:r>
-        <w:t xml:space="preserve"> </w:t>
-      </w:r>
-      <w:proofErr w:type="spellStart"/>
-      <w:r>
-        <w:t>thức</w:t>
-      </w:r>
-      <w:proofErr w:type="spellEnd"/>
-      <w:r>
-        <w:t xml:space="preserve"> </w:t>
-      </w:r>
-      <w:proofErr w:type="spellStart"/>
-      <w:r>
-        <w:t>ghi</w:t>
-      </w:r>
-      <w:proofErr w:type="spellEnd"/>
-      <w:r>
-        <w:t xml:space="preserve"> </w:t>
-      </w:r>
-      <w:proofErr w:type="spellStart"/>
-      <w:r>
-        <w:t>đè</w:t>
-      </w:r>
-      <w:proofErr w:type="spellEnd"/>
-      <w:r>
-        <w:t xml:space="preserve"> (override):</w:t>
-      </w:r>
-    </w:p>
-    <w:p>
-      <w:r>
-        <w:t xml:space="preserve">+ double </w:t>
-      </w:r>
-      <w:proofErr w:type="spellStart"/>
-      <w:proofErr w:type="gramStart"/>
-      <w:r>
-        <w:t>calculateMaintenanceCost</w:t>
-      </w:r>
-      <w:proofErr w:type="spellEnd"/>
-      <w:r>
-        <w:t>(</w:t>
-      </w:r>
-      <w:proofErr w:type="gramEnd"/>
-      <w:r>
-        <w:t>)</w:t>
-      </w:r>
-    </w:p>
-    <w:p>
-      <w:r>
-        <w:t xml:space="preserve">+ string </w:t>
-      </w:r>
-      <w:proofErr w:type="spellStart"/>
-      <w:proofErr w:type="gramStart"/>
-      <w:r>
-        <w:t>displayInfo</w:t>
-      </w:r>
-      <w:proofErr w:type="spellEnd"/>
-      <w:r>
-        <w:t>(</w:t>
-      </w:r>
-      <w:proofErr w:type="gramEnd"/>
-      <w:r>
-        <w:t>)</w:t>
-      </w:r>
-    </w:p>
-    <w:p>
-      <w:r>
-        <w:t>2.4. Projector</w:t>
-      </w:r>
-    </w:p>
-    <w:p>
-      <w:r>
-        <w:t xml:space="preserve">Các </w:t>
-      </w:r>
-      <w:proofErr w:type="spellStart"/>
-      <w:r>
-        <w:t>thuộc</w:t>
-      </w:r>
-      <w:proofErr w:type="spellEnd"/>
-      <w:r>
-        <w:t xml:space="preserve"> </w:t>
-      </w:r>
-      <w:proofErr w:type="spellStart"/>
-      <w:r>
-        <w:t>tính</w:t>
-      </w:r>
-      <w:proofErr w:type="spellEnd"/>
-      <w:r>
-        <w:t>:</w:t>
-      </w:r>
-    </w:p>
-    <w:p>
-      <w:r>
-        <w:t xml:space="preserve">- brightness: </w:t>
-      </w:r>
-      <w:proofErr w:type="spellStart"/>
-      <w:r>
-        <w:t>độ</w:t>
-      </w:r>
-      <w:proofErr w:type="spellEnd"/>
-      <w:r>
-        <w:t xml:space="preserve"> </w:t>
-      </w:r>
-      <w:proofErr w:type="spellStart"/>
-      <w:r>
-        <w:t>sáng</w:t>
-      </w:r>
-      <w:proofErr w:type="spellEnd"/>
-      <w:r>
-        <w:t xml:space="preserve"> (int)</w:t>
-      </w:r>
-    </w:p>
-    <w:p>
-      <w:r>
-        <w:t xml:space="preserve">- </w:t>
-      </w:r>
-      <w:proofErr w:type="spellStart"/>
-      <w:r>
-        <w:t>lampHoursUsed</w:t>
-      </w:r>
-      <w:proofErr w:type="spellEnd"/>
-      <w:r>
-        <w:t>: double</w:t>
-      </w:r>
+        <w:t xml:space="preserve"> </w:t>
+      </w:r>
+      <w:proofErr w:type="spellStart"/>
+      <w:r>
+        <w:t>âm</w:t>
+      </w:r>
+      <w:proofErr w:type="spellEnd"/>
     </w:p>
     <w:p>
       <w:r>
@@ -6988,6 +7283,149 @@
       <w:proofErr w:type="gramEnd"/>
       <w:r>
         <w:t>)</w:t>
+      </w:r>
+    </w:p>
+    <w:p>
+      <w:r>
+        <w:t xml:space="preserve">Chi </w:t>
+      </w:r>
+      <w:proofErr w:type="spellStart"/>
+      <w:r>
+        <w:t>phí</w:t>
+      </w:r>
+      <w:proofErr w:type="spellEnd"/>
+      <w:r>
+        <w:t xml:space="preserve"> </w:t>
+      </w:r>
+      <w:proofErr w:type="spellStart"/>
+      <w:r>
+        <w:t>bảo</w:t>
+      </w:r>
+      <w:proofErr w:type="spellEnd"/>
+      <w:r>
+        <w:t xml:space="preserve"> </w:t>
+      </w:r>
+      <w:proofErr w:type="spellStart"/>
+      <w:r>
+        <w:t>trì</w:t>
+      </w:r>
+      <w:proofErr w:type="spellEnd"/>
+      <w:r>
+        <w:t>:</w:t>
+      </w:r>
+    </w:p>
+    <w:p>
+      <w:r>
+        <w:t xml:space="preserve">- 3% </w:t>
+      </w:r>
+      <w:proofErr w:type="spellStart"/>
+      <w:r>
+        <w:t>giá</w:t>
+      </w:r>
+      <w:proofErr w:type="spellEnd"/>
+      <w:r>
+        <w:t xml:space="preserve"> </w:t>
+      </w:r>
+      <w:proofErr w:type="spellStart"/>
+      <w:r>
+        <w:t>mua</w:t>
+      </w:r>
+      <w:proofErr w:type="spellEnd"/>
+      <w:r>
+        <w:t xml:space="preserve">. </w:t>
+      </w:r>
+    </w:p>
+    <w:p>
+      <w:r>
+        <w:t xml:space="preserve">- </w:t>
+      </w:r>
+      <w:proofErr w:type="spellStart"/>
+      <w:r>
+        <w:t>Cộng</w:t>
+      </w:r>
+      <w:proofErr w:type="spellEnd"/>
+      <w:r>
+        <w:t xml:space="preserve"> </w:t>
+      </w:r>
+      <w:proofErr w:type="spellStart"/>
+      <w:r>
+        <w:t>thêm</w:t>
+      </w:r>
+      <w:proofErr w:type="spellEnd"/>
+      <w:r>
+        <w:t xml:space="preserve"> 1.500.000 </w:t>
+      </w:r>
+      <w:proofErr w:type="spellStart"/>
+      <w:r>
+        <w:t>đồng</w:t>
+      </w:r>
+      <w:proofErr w:type="spellEnd"/>
+      <w:r>
+        <w:t xml:space="preserve"> </w:t>
+      </w:r>
+      <w:proofErr w:type="spellStart"/>
+      <w:r>
+        <w:t>nếu</w:t>
+      </w:r>
+      <w:proofErr w:type="spellEnd"/>
+      <w:r>
+        <w:t xml:space="preserve"> </w:t>
+      </w:r>
+      <w:proofErr w:type="spellStart"/>
+      <w:r>
+        <w:t>bóng</w:t>
+      </w:r>
+      <w:proofErr w:type="spellEnd"/>
+      <w:r>
+        <w:t xml:space="preserve"> </w:t>
+      </w:r>
+      <w:proofErr w:type="spellStart"/>
+      <w:r>
+        <w:t>đèn</w:t>
+      </w:r>
+      <w:proofErr w:type="spellEnd"/>
+      <w:r>
+        <w:t xml:space="preserve"> </w:t>
+      </w:r>
+      <w:proofErr w:type="spellStart"/>
+      <w:r>
+        <w:t>đã</w:t>
+      </w:r>
+      <w:proofErr w:type="spellEnd"/>
+      <w:r>
+        <w:t xml:space="preserve"> </w:t>
+      </w:r>
+      <w:proofErr w:type="spellStart"/>
+      <w:r>
+        <w:t>sử</w:t>
+      </w:r>
+      <w:proofErr w:type="spellEnd"/>
+      <w:r>
+        <w:t xml:space="preserve"> </w:t>
+      </w:r>
+      <w:proofErr w:type="spellStart"/>
+      <w:r>
+        <w:t>dụng</w:t>
+      </w:r>
+      <w:proofErr w:type="spellEnd"/>
+      <w:r>
+        <w:t xml:space="preserve"> </w:t>
+      </w:r>
+      <w:proofErr w:type="spellStart"/>
+      <w:r>
+        <w:t>trên</w:t>
+      </w:r>
+      <w:proofErr w:type="spellEnd"/>
+      <w:r>
+        <w:t xml:space="preserve"> 3.000 </w:t>
+      </w:r>
+      <w:proofErr w:type="spellStart"/>
+      <w:r>
+        <w:t>giờ</w:t>
+      </w:r>
+      <w:proofErr w:type="spellEnd"/>
+      <w:r>
+        <w:t>.</w:t>
       </w:r>
     </w:p>
     <w:p>
@@ -7922,6 +8360,7 @@
     </w:p>
     <w:p>
       <w:r>
+        <w:lastRenderedPageBreak/>
         <w:t xml:space="preserve">+ bool </w:t>
       </w:r>
       <w:proofErr w:type="spellStart"/>
@@ -8098,7 +8537,6 @@
     </w:p>
     <w:p>
       <w:r>
-        <w:lastRenderedPageBreak/>
         <w:t xml:space="preserve">+ List&lt;Device&gt; </w:t>
       </w:r>
       <w:proofErr w:type="spellStart"/>
@@ -8260,6 +8698,510 @@
       <w:r>
         <w:t>.</w:t>
       </w:r>
+    </w:p>
+    <w:p>
+      <w:r>
+        <w:t xml:space="preserve">Quy </w:t>
+      </w:r>
+      <w:proofErr w:type="spellStart"/>
+      <w:r>
+        <w:t>tắc</w:t>
+      </w:r>
+      <w:proofErr w:type="spellEnd"/>
+      <w:r>
+        <w:t xml:space="preserve">: </w:t>
+      </w:r>
+    </w:p>
+    <w:p>
+      <w:r>
+        <w:t>1. K</w:t>
+      </w:r>
+      <w:proofErr w:type="spellStart"/>
+      <w:r>
+        <w:t>hông</w:t>
+      </w:r>
+      <w:proofErr w:type="spellEnd"/>
+      <w:r>
+        <w:t xml:space="preserve"> </w:t>
+      </w:r>
+      <w:proofErr w:type="spellStart"/>
+      <w:r>
+        <w:t>thêm</w:t>
+      </w:r>
+      <w:proofErr w:type="spellEnd"/>
+      <w:r>
+        <w:t xml:space="preserve"> </w:t>
+      </w:r>
+      <w:proofErr w:type="spellStart"/>
+      <w:r>
+        <w:t>hai</w:t>
+      </w:r>
+      <w:proofErr w:type="spellEnd"/>
+      <w:r>
+        <w:t xml:space="preserve"> </w:t>
+      </w:r>
+      <w:proofErr w:type="spellStart"/>
+      <w:r>
+        <w:t>thiết</w:t>
+      </w:r>
+      <w:proofErr w:type="spellEnd"/>
+      <w:r>
+        <w:t xml:space="preserve"> </w:t>
+      </w:r>
+      <w:proofErr w:type="spellStart"/>
+      <w:r>
+        <w:t>bị</w:t>
+      </w:r>
+      <w:proofErr w:type="spellEnd"/>
+      <w:r>
+        <w:t xml:space="preserve"> </w:t>
+      </w:r>
+      <w:proofErr w:type="spellStart"/>
+      <w:r>
+        <w:t>có</w:t>
+      </w:r>
+      <w:proofErr w:type="spellEnd"/>
+      <w:r>
+        <w:t xml:space="preserve"> </w:t>
+      </w:r>
+      <w:proofErr w:type="spellStart"/>
+      <w:r>
+        <w:t>cùng</w:t>
+      </w:r>
+      <w:proofErr w:type="spellEnd"/>
+      <w:r>
+        <w:t xml:space="preserve"> </w:t>
+      </w:r>
+      <w:proofErr w:type="spellStart"/>
+      <w:r>
+        <w:t>mã</w:t>
+      </w:r>
+      <w:proofErr w:type="spellEnd"/>
+      <w:r>
+        <w:t xml:space="preserve"> </w:t>
+      </w:r>
+      <w:proofErr w:type="spellStart"/>
+      <w:r>
+        <w:t>vào</w:t>
+      </w:r>
+      <w:proofErr w:type="spellEnd"/>
+      <w:r>
+        <w:t xml:space="preserve"> </w:t>
+      </w:r>
+      <w:proofErr w:type="spellStart"/>
+      <w:r>
+        <w:t>một</w:t>
+      </w:r>
+      <w:proofErr w:type="spellEnd"/>
+      <w:r>
+        <w:t xml:space="preserve"> </w:t>
+      </w:r>
+      <w:proofErr w:type="spellStart"/>
+      <w:r>
+        <w:t>phòng</w:t>
+      </w:r>
+      <w:proofErr w:type="spellEnd"/>
+      <w:r>
+        <w:t xml:space="preserve">. </w:t>
+      </w:r>
+    </w:p>
+    <w:p>
+      <w:r>
+        <w:t>2. K</w:t>
+      </w:r>
+      <w:proofErr w:type="spellStart"/>
+      <w:r>
+        <w:t>hông</w:t>
+      </w:r>
+      <w:proofErr w:type="spellEnd"/>
+      <w:r>
+        <w:t xml:space="preserve"> </w:t>
+      </w:r>
+      <w:proofErr w:type="spellStart"/>
+      <w:r>
+        <w:t>chấp</w:t>
+      </w:r>
+      <w:proofErr w:type="spellEnd"/>
+      <w:r>
+        <w:t xml:space="preserve"> </w:t>
+      </w:r>
+      <w:proofErr w:type="spellStart"/>
+      <w:r>
+        <w:t>nhận</w:t>
+      </w:r>
+      <w:proofErr w:type="spellEnd"/>
+      <w:r>
+        <w:t xml:space="preserve"> </w:t>
+      </w:r>
+      <w:proofErr w:type="spellStart"/>
+      <w:r>
+        <w:t>đối</w:t>
+      </w:r>
+      <w:proofErr w:type="spellEnd"/>
+      <w:r>
+        <w:t xml:space="preserve"> </w:t>
+      </w:r>
+      <w:proofErr w:type="spellStart"/>
+      <w:r>
+        <w:t>tượng</w:t>
+      </w:r>
+      <w:proofErr w:type="spellEnd"/>
+      <w:r>
+        <w:t xml:space="preserve"> </w:t>
+      </w:r>
+      <w:proofErr w:type="spellStart"/>
+      <w:r>
+        <w:t>thiết</w:t>
+      </w:r>
+      <w:proofErr w:type="spellEnd"/>
+      <w:r>
+        <w:t xml:space="preserve"> </w:t>
+      </w:r>
+      <w:proofErr w:type="spellStart"/>
+      <w:r>
+        <w:t>bị</w:t>
+      </w:r>
+      <w:proofErr w:type="spellEnd"/>
+      <w:r>
+        <w:t xml:space="preserve"> null. </w:t>
+      </w:r>
+    </w:p>
+    <w:p>
+      <w:r>
+        <w:t xml:space="preserve">3. </w:t>
+      </w:r>
+      <w:proofErr w:type="gramStart"/>
+      <w:r>
+        <w:t>C</w:t>
+      </w:r>
+      <w:proofErr w:type="spellStart"/>
+      <w:r>
+        <w:t>alculateAnnualMaintenanceCost</w:t>
+      </w:r>
+      <w:proofErr w:type="spellEnd"/>
+      <w:r>
+        <w:t>(</w:t>
+      </w:r>
+      <w:proofErr w:type="gramEnd"/>
+      <w:r>
+        <w:t xml:space="preserve">) </w:t>
+      </w:r>
+      <w:proofErr w:type="spellStart"/>
+      <w:r>
+        <w:t>phải</w:t>
+      </w:r>
+      <w:proofErr w:type="spellEnd"/>
+      <w:r>
+        <w:t xml:space="preserve"> </w:t>
+      </w:r>
+      <w:proofErr w:type="spellStart"/>
+      <w:r>
+        <w:t>sử</w:t>
+      </w:r>
+      <w:proofErr w:type="spellEnd"/>
+      <w:r>
+        <w:t xml:space="preserve"> </w:t>
+      </w:r>
+      <w:proofErr w:type="spellStart"/>
+      <w:r>
+        <w:t>dụng</w:t>
+      </w:r>
+      <w:proofErr w:type="spellEnd"/>
+      <w:r>
+        <w:t xml:space="preserve"> </w:t>
+      </w:r>
+      <w:proofErr w:type="spellStart"/>
+      <w:r>
+        <w:t>tính</w:t>
+      </w:r>
+      <w:proofErr w:type="spellEnd"/>
+      <w:r>
+        <w:t xml:space="preserve"> </w:t>
+      </w:r>
+      <w:proofErr w:type="spellStart"/>
+      <w:r>
+        <w:t>đa</w:t>
+      </w:r>
+      <w:proofErr w:type="spellEnd"/>
+      <w:r>
+        <w:t xml:space="preserve"> </w:t>
+      </w:r>
+      <w:proofErr w:type="spellStart"/>
+      <w:r>
+        <w:t>hình</w:t>
+      </w:r>
+      <w:proofErr w:type="spellEnd"/>
+      <w:r>
+        <w:t xml:space="preserve">, </w:t>
+      </w:r>
+      <w:proofErr w:type="spellStart"/>
+      <w:r>
+        <w:t>không</w:t>
+      </w:r>
+      <w:proofErr w:type="spellEnd"/>
+      <w:r>
+        <w:t xml:space="preserve"> </w:t>
+      </w:r>
+      <w:proofErr w:type="spellStart"/>
+      <w:r>
+        <w:t>kiểm</w:t>
+      </w:r>
+      <w:proofErr w:type="spellEnd"/>
+      <w:r>
+        <w:t xml:space="preserve"> </w:t>
+      </w:r>
+      <w:proofErr w:type="spellStart"/>
+      <w:r>
+        <w:t>tra</w:t>
+      </w:r>
+      <w:proofErr w:type="spellEnd"/>
+      <w:r>
+        <w:t xml:space="preserve"> </w:t>
+      </w:r>
+      <w:proofErr w:type="spellStart"/>
+      <w:r>
+        <w:t>lần</w:t>
+      </w:r>
+      <w:proofErr w:type="spellEnd"/>
+      <w:r>
+        <w:t xml:space="preserve"> </w:t>
+      </w:r>
+      <w:proofErr w:type="spellStart"/>
+      <w:r>
+        <w:t>lượt</w:t>
+      </w:r>
+      <w:proofErr w:type="spellEnd"/>
+      <w:r>
+        <w:t xml:space="preserve"> </w:t>
+      </w:r>
+      <w:proofErr w:type="spellStart"/>
+      <w:r>
+        <w:t>bằng</w:t>
+      </w:r>
+      <w:proofErr w:type="spellEnd"/>
+      <w:r>
+        <w:t xml:space="preserve"> if </w:t>
+      </w:r>
+      <w:proofErr w:type="spellStart"/>
+      <w:r>
+        <w:t>hoặc</w:t>
+      </w:r>
+      <w:proofErr w:type="spellEnd"/>
+      <w:r>
+        <w:t xml:space="preserve"> switch </w:t>
+      </w:r>
+      <w:proofErr w:type="spellStart"/>
+      <w:r>
+        <w:t>xem</w:t>
+      </w:r>
+      <w:proofErr w:type="spellEnd"/>
+      <w:r>
+        <w:t xml:space="preserve"> </w:t>
+      </w:r>
+      <w:proofErr w:type="spellStart"/>
+      <w:r>
+        <w:t>thiết</w:t>
+      </w:r>
+      <w:proofErr w:type="spellEnd"/>
+      <w:r>
+        <w:t xml:space="preserve"> </w:t>
+      </w:r>
+      <w:proofErr w:type="spellStart"/>
+      <w:r>
+        <w:t>bị</w:t>
+      </w:r>
+      <w:proofErr w:type="spellEnd"/>
+      <w:r>
+        <w:t xml:space="preserve"> </w:t>
+      </w:r>
+      <w:proofErr w:type="spellStart"/>
+      <w:r>
+        <w:t>thuộc</w:t>
+      </w:r>
+      <w:proofErr w:type="spellEnd"/>
+      <w:r>
+        <w:t xml:space="preserve"> </w:t>
+      </w:r>
+      <w:proofErr w:type="spellStart"/>
+      <w:r>
+        <w:t>lớp</w:t>
+      </w:r>
+      <w:proofErr w:type="spellEnd"/>
+      <w:r>
+        <w:t xml:space="preserve"> </w:t>
+      </w:r>
+      <w:proofErr w:type="spellStart"/>
+      <w:r>
+        <w:t>nào</w:t>
+      </w:r>
+      <w:proofErr w:type="spellEnd"/>
+      <w:r>
+        <w:t xml:space="preserve">. </w:t>
+      </w:r>
+    </w:p>
+    <w:p>
+      <w:r>
+        <w:t xml:space="preserve">4. </w:t>
+      </w:r>
+      <w:proofErr w:type="gramStart"/>
+      <w:r>
+        <w:t>G</w:t>
+      </w:r>
+      <w:proofErr w:type="spellStart"/>
+      <w:r>
+        <w:t>etDevicesRequiringMaintenance</w:t>
+      </w:r>
+      <w:proofErr w:type="spellEnd"/>
+      <w:r>
+        <w:t>(</w:t>
+      </w:r>
+      <w:proofErr w:type="gramEnd"/>
+      <w:r>
+        <w:t xml:space="preserve">) </w:t>
+      </w:r>
+      <w:proofErr w:type="spellStart"/>
+      <w:r>
+        <w:t>trả</w:t>
+      </w:r>
+      <w:proofErr w:type="spellEnd"/>
+      <w:r>
+        <w:t xml:space="preserve"> </w:t>
+      </w:r>
+      <w:proofErr w:type="spellStart"/>
+      <w:r>
+        <w:t>về</w:t>
+      </w:r>
+      <w:proofErr w:type="spellEnd"/>
+      <w:r>
+        <w:t xml:space="preserve"> </w:t>
+      </w:r>
+      <w:proofErr w:type="spellStart"/>
+      <w:r>
+        <w:t>các</w:t>
+      </w:r>
+      <w:proofErr w:type="spellEnd"/>
+      <w:r>
+        <w:t xml:space="preserve"> </w:t>
+      </w:r>
+      <w:proofErr w:type="spellStart"/>
+      <w:r>
+        <w:t>thiết</w:t>
+      </w:r>
+      <w:proofErr w:type="spellEnd"/>
+      <w:r>
+        <w:t xml:space="preserve"> </w:t>
+      </w:r>
+      <w:proofErr w:type="spellStart"/>
+      <w:r>
+        <w:t>bị</w:t>
+      </w:r>
+      <w:proofErr w:type="spellEnd"/>
+      <w:r>
+        <w:t>:</w:t>
+      </w:r>
+    </w:p>
+    <w:p>
+      <w:r>
+        <w:t xml:space="preserve"> o </w:t>
+      </w:r>
+      <w:proofErr w:type="spellStart"/>
+      <w:r>
+        <w:t>Đang</w:t>
+      </w:r>
+      <w:proofErr w:type="spellEnd"/>
+      <w:r>
+        <w:t xml:space="preserve"> ở </w:t>
+      </w:r>
+      <w:proofErr w:type="spellStart"/>
+      <w:r>
+        <w:t>trạng</w:t>
+      </w:r>
+      <w:proofErr w:type="spellEnd"/>
+      <w:r>
+        <w:t xml:space="preserve"> </w:t>
+      </w:r>
+      <w:proofErr w:type="spellStart"/>
+      <w:r>
+        <w:t>thái</w:t>
+      </w:r>
+      <w:proofErr w:type="spellEnd"/>
+      <w:r>
+        <w:t xml:space="preserve"> </w:t>
+      </w:r>
+      <w:proofErr w:type="spellStart"/>
+      <w:r>
+        <w:t>UnderMaintenance</w:t>
+      </w:r>
+      <w:proofErr w:type="spellEnd"/>
+      <w:r>
+        <w:t xml:space="preserve">; </w:t>
+      </w:r>
+      <w:proofErr w:type="spellStart"/>
+      <w:r>
+        <w:t>hoặc</w:t>
+      </w:r>
+      <w:proofErr w:type="spellEnd"/>
+      <w:r>
+        <w:t xml:space="preserve"> </w:t>
+      </w:r>
+    </w:p>
+    <w:p>
+      <w:r>
+        <w:t xml:space="preserve">o </w:t>
+      </w:r>
+      <w:proofErr w:type="spellStart"/>
+      <w:r>
+        <w:t>Có</w:t>
+      </w:r>
+      <w:proofErr w:type="spellEnd"/>
+      <w:r>
+        <w:t xml:space="preserve"> </w:t>
+      </w:r>
+      <w:proofErr w:type="spellStart"/>
+      <w:r>
+        <w:t>thời</w:t>
+      </w:r>
+      <w:proofErr w:type="spellEnd"/>
+      <w:r>
+        <w:t xml:space="preserve"> </w:t>
+      </w:r>
+      <w:proofErr w:type="spellStart"/>
+      <w:r>
+        <w:t>gian</w:t>
+      </w:r>
+      <w:proofErr w:type="spellEnd"/>
+      <w:r>
+        <w:t xml:space="preserve"> </w:t>
+      </w:r>
+      <w:proofErr w:type="spellStart"/>
+      <w:r>
+        <w:t>sử</w:t>
+      </w:r>
+      <w:proofErr w:type="spellEnd"/>
+      <w:r>
+        <w:t xml:space="preserve"> </w:t>
+      </w:r>
+      <w:proofErr w:type="spellStart"/>
+      <w:r>
+        <w:t>dụng</w:t>
+      </w:r>
+      <w:proofErr w:type="spellEnd"/>
+      <w:r>
+        <w:t xml:space="preserve"> </w:t>
+      </w:r>
+      <w:proofErr w:type="spellStart"/>
+      <w:r>
+        <w:t>trên</w:t>
+      </w:r>
+      <w:proofErr w:type="spellEnd"/>
+      <w:r>
+        <w:t xml:space="preserve"> 5 </w:t>
+      </w:r>
+      <w:proofErr w:type="spellStart"/>
+      <w:r>
+        <w:t>năm</w:t>
+      </w:r>
+      <w:proofErr w:type="spellEnd"/>
     </w:p>
     <w:p>
       <w:pPr>
@@ -8307,54 +9249,7 @@
       <w:proofErr w:type="spellEnd"/>
     </w:p>
     <w:p/>
-    <w:p>
-      <w:r>
-        <w:rPr>
-          <w:noProof/>
-        </w:rPr>
-        <w:drawing>
-          <wp:inline distT="0" distB="0" distL="0" distR="0" wp14:anchorId="42CE3B6C" wp14:editId="39F9FC84">
-            <wp:extent cx="5943600" cy="5821680"/>
-            <wp:effectExtent l="0" t="0" r="0" b="7620"/>
-            <wp:docPr id="1921294601" name="Graphic 1"/>
-            <wp:cNvGraphicFramePr>
-              <a:graphicFrameLocks xmlns:a="http://schemas.openxmlformats.org/drawingml/2006/main" noChangeAspect="1"/>
-            </wp:cNvGraphicFramePr>
-            <a:graphic xmlns:a="http://schemas.openxmlformats.org/drawingml/2006/main">
-              <a:graphicData uri="http://schemas.openxmlformats.org/drawingml/2006/picture">
-                <pic:pic xmlns:pic="http://schemas.openxmlformats.org/drawingml/2006/picture">
-                  <pic:nvPicPr>
-                    <pic:cNvPr id="1921294601" name="Graphic 1921294601"/>
-                    <pic:cNvPicPr/>
-                  </pic:nvPicPr>
-                  <pic:blipFill>
-                    <a:blip r:embed="rId5">
-                      <a:extLst>
-                        <a:ext uri="{96DAC541-7B7A-43D3-8B79-37D633B846F1}">
-                          <asvg:svgBlip xmlns:asvg="http://schemas.microsoft.com/office/drawing/2016/SVG/main" r:embed="rId6"/>
-                        </a:ext>
-                      </a:extLst>
-                    </a:blip>
-                    <a:stretch>
-                      <a:fillRect/>
-                    </a:stretch>
-                  </pic:blipFill>
-                  <pic:spPr>
-                    <a:xfrm>
-                      <a:off x="0" y="0"/>
-                      <a:ext cx="5943600" cy="5821680"/>
-                    </a:xfrm>
-                    <a:prstGeom prst="rect">
-                      <a:avLst/>
-                    </a:prstGeom>
-                  </pic:spPr>
-                </pic:pic>
-              </a:graphicData>
-            </a:graphic>
-          </wp:inline>
-        </w:drawing>
-      </w:r>
-    </w:p>
+    <w:p/>
     <w:p/>
     <w:p/>
     <w:p/>
@@ -9359,7 +10254,6 @@
   <w:style w:type="character" w:default="1" w:styleId="DefaultParagraphFont">
     <w:name w:val="Default Paragraph Font"/>
     <w:uiPriority w:val="1"/>
-    <w:semiHidden/>
     <w:unhideWhenUsed/>
   </w:style>
   <w:style w:type="table" w:default="1" w:styleId="TableNormal">
@@ -9671,6 +10565,29 @@
       <w:spacing w:val="5"/>
     </w:rPr>
   </w:style>
+  <w:style w:type="character" w:styleId="Hyperlink">
+    <w:name w:val="Hyperlink"/>
+    <w:basedOn w:val="DefaultParagraphFont"/>
+    <w:uiPriority w:val="99"/>
+    <w:unhideWhenUsed/>
+    <w:rsid w:val="00275D92"/>
+    <w:rPr>
+      <w:color w:val="467886" w:themeColor="hyperlink"/>
+      <w:u w:val="single"/>
+    </w:rPr>
+  </w:style>
+  <w:style w:type="character" w:styleId="UnresolvedMention">
+    <w:name w:val="Unresolved Mention"/>
+    <w:basedOn w:val="DefaultParagraphFont"/>
+    <w:uiPriority w:val="99"/>
+    <w:semiHidden/>
+    <w:unhideWhenUsed/>
+    <w:rsid w:val="00275D92"/>
+    <w:rPr>
+      <w:color w:val="605E5C"/>
+      <w:shd w:val="clear" w:color="auto" w:fill="E1DFDD"/>
+    </w:rPr>
+  </w:style>
 </w:styles>
 </file>
 

</xml_diff>